<commit_message>
Add in-person events tracking + calendar sync, Direct Corporate Prospect channel
- New Events tab + live Google Calendar sync for in-person networking
  (IREM Michigan Sporting Clays Classic Aug 20 2026 added to calendar;
  BOMA Trade Fair confirmed already passed for this cycle -- flagged
  instead of added as upcoming).
- New Direct Corporate Prospect channel: companies with a specific,
  dated relocation/expansion signal, sourced via Crain's Detroit
  Business "Companies on the Move" coverage -- F.H. Paschen, Gardner
  White, and Eccalon added with real evidence citations.
- Outreach Toolkit: new In-Person Event Playbook (what to bring, pitch,
  same-day follow-up discipline).

Co-Authored-By: Claude Sonnet 5 <noreply@anthropic.com>
</commit_message>
<xml_diff>
--- a/Outreach_Toolkit.docx
+++ b/Outreach_Toolkit.docx
@@ -1332,6 +1332,400 @@
           <w:szCs w:val="21"/>
         </w:rPr>
         <w:t xml:space="preserve">Thanks — [Your Name] / [Your Phone]</w:t>
+      </w:r>
+    </w:p>
+    <w:p>
+      <w:r>
+        <w:br w:type="page"/>
+      </w:r>
+    </w:p>
+    <w:p>
+      <w:pPr>
+        <w:pStyle w:val="Heading1"/>
+        <w:pBdr>
+          <w:bottom w:val="single" w:color="2E5266" w:sz="6" w:space="4"/>
+        </w:pBdr>
+        <w:spacing w:after="160" w:before="300"/>
+      </w:pPr>
+      <w:r>
+        <w:rPr>
+          <w:rFonts w:ascii="Calibri" w:cs="Calibri" w:eastAsia="Calibri" w:hAnsi="Calibri"/>
+          <w:b/>
+          <w:bCs/>
+          <w:color w:val="1F2933"/>
+          <w:sz w:val="30"/>
+          <w:szCs w:val="30"/>
+        </w:rPr>
+        <w:t xml:space="preserve">In-Person Event Playbook</w:t>
+      </w:r>
+    </w:p>
+    <w:p>
+      <w:pPr>
+        <w:spacing w:after="200" w:before="80"/>
+      </w:pPr>
+      <w:r>
+        <w:rPr>
+          <w:rFonts w:ascii="Calibri" w:cs="Calibri" w:eastAsia="Calibri" w:hAnsi="Calibri"/>
+          <w:i/>
+          <w:iCs/>
+          <w:color w:val="616E7C"/>
+          <w:sz w:val="18"/>
+          <w:szCs w:val="18"/>
+        </w:rPr>
+        <w:t xml:space="preserve">For BOMA Metro Detroit / IREM Michigan events and anything similar — see the Events tab in the lead-gen workbook for which specific ones are coming up.</w:t>
+      </w:r>
+    </w:p>
+    <w:p>
+      <w:pPr>
+        <w:pStyle w:val="Heading2"/>
+        <w:spacing w:after="100" w:before="240"/>
+      </w:pPr>
+      <w:r>
+        <w:rPr>
+          <w:rFonts w:ascii="Calibri" w:cs="Calibri" w:eastAsia="Calibri" w:hAnsi="Calibri"/>
+          <w:b/>
+          <w:bCs/>
+          <w:color w:val="2E5266"/>
+          <w:sz w:val="24"/>
+          <w:szCs w:val="24"/>
+        </w:rPr>
+        <w:t xml:space="preserve">What to bring</w:t>
+      </w:r>
+    </w:p>
+    <w:p>
+      <w:pPr>
+        <w:pStyle w:val="ListParagraph"/>
+        <w:numPr>
+          <w:ilvl w:val="0"/>
+          <w:numId w:val="2"/>
+        </w:numPr>
+        <w:spacing w:after="80"/>
+      </w:pPr>
+      <w:r>
+        <w:rPr>
+          <w:rFonts w:ascii="Calibri" w:cs="Calibri" w:eastAsia="Calibri" w:hAnsi="Calibri"/>
+          <w:color w:val="1F2933"/>
+          <w:sz w:val="21"/>
+          <w:szCs w:val="21"/>
+        </w:rPr>
+        <w:t xml:space="preserve">50+ business cards — trade-association events run into the hundreds of attendees; you will run out faster than you think</w:t>
+      </w:r>
+    </w:p>
+    <w:p>
+      <w:pPr>
+        <w:pStyle w:val="ListParagraph"/>
+        <w:numPr>
+          <w:ilvl w:val="0"/>
+          <w:numId w:val="2"/>
+        </w:numPr>
+        <w:spacing w:after="80"/>
+      </w:pPr>
+      <w:r>
+        <w:rPr>
+          <w:rFonts w:ascii="Calibri" w:cs="Calibri" w:eastAsia="Calibri" w:hAnsi="Calibri"/>
+          <w:color w:val="1F2933"/>
+          <w:sz w:val="21"/>
+          <w:szCs w:val="21"/>
+        </w:rPr>
+        <w:t xml:space="preserve">A few printed copies of the capabilities one-pager (page 1 of this doc) for anyone who wants something more than a card</w:t>
+      </w:r>
+    </w:p>
+    <w:p>
+      <w:pPr>
+        <w:pStyle w:val="ListParagraph"/>
+        <w:numPr>
+          <w:ilvl w:val="0"/>
+          <w:numId w:val="2"/>
+        </w:numPr>
+        <w:spacing w:after="80"/>
+      </w:pPr>
+      <w:r>
+        <w:rPr>
+          <w:rFonts w:ascii="Calibri" w:cs="Calibri" w:eastAsia="Calibri" w:hAnsi="Calibri"/>
+          <w:color w:val="1F2933"/>
+          <w:sz w:val="21"/>
+          <w:szCs w:val="21"/>
+        </w:rPr>
+        <w:t xml:space="preserve">Phone charged, calendar open — the goal of most conversations is booking a follow-up call, not closing anything on the spot</w:t>
+      </w:r>
+    </w:p>
+    <w:p>
+      <w:pPr>
+        <w:pStyle w:val="ListParagraph"/>
+        <w:numPr>
+          <w:ilvl w:val="0"/>
+          <w:numId w:val="2"/>
+        </w:numPr>
+        <w:spacing w:after="80"/>
+      </w:pPr>
+      <w:r>
+        <w:rPr>
+          <w:rFonts w:ascii="Calibri" w:cs="Calibri" w:eastAsia="Calibri" w:hAnsi="Calibri"/>
+          <w:color w:val="1F2933"/>
+          <w:sz w:val="21"/>
+          <w:szCs w:val="21"/>
+        </w:rPr>
+        <w:t xml:space="preserve">A small notebook or your phone's notes app — write down who you talked to and one detail about them the moment you step away; you will not remember 15 conversations by the end</w:t>
+      </w:r>
+    </w:p>
+    <w:p>
+      <w:pPr>
+        <w:pStyle w:val="ListParagraph"/>
+        <w:numPr>
+          <w:ilvl w:val="0"/>
+          <w:numId w:val="2"/>
+        </w:numPr>
+        <w:spacing w:after="80"/>
+      </w:pPr>
+      <w:r>
+        <w:rPr>
+          <w:rFonts w:ascii="Calibri" w:cs="Calibri" w:eastAsia="Calibri" w:hAnsi="Calibri"/>
+          <w:color w:val="1F2933"/>
+          <w:sz w:val="21"/>
+          <w:szCs w:val="21"/>
+        </w:rPr>
+        <w:t xml:space="preserve">Comfortable, business-casual attire appropriate to the event (golf/clay-shoot events are business-casual/athletic, not suit-and-tie — check the specific event)</w:t>
+      </w:r>
+    </w:p>
+    <w:p>
+      <w:pPr>
+        <w:pStyle w:val="ListParagraph"/>
+        <w:numPr>
+          <w:ilvl w:val="0"/>
+          <w:numId w:val="2"/>
+        </w:numPr>
+        <w:spacing w:after="80"/>
+      </w:pPr>
+      <w:r>
+        <w:rPr>
+          <w:rFonts w:ascii="Calibri" w:cs="Calibri" w:eastAsia="Calibri" w:hAnsi="Calibri"/>
+          <w:color w:val="1F2933"/>
+          <w:sz w:val="21"/>
+          <w:szCs w:val="21"/>
+        </w:rPr>
+        <w:t xml:space="preserve">A COI copy is not necessary to carry to a networking event — that comes after a real conversation, not as a leave-behind to strangers</w:t>
+      </w:r>
+    </w:p>
+    <w:p>
+      <w:pPr>
+        <w:pStyle w:val="Heading2"/>
+        <w:spacing w:after="100" w:before="240"/>
+      </w:pPr>
+      <w:r>
+        <w:rPr>
+          <w:rFonts w:ascii="Calibri" w:cs="Calibri" w:eastAsia="Calibri" w:hAnsi="Calibri"/>
+          <w:b/>
+          <w:bCs/>
+          <w:color w:val="2E5266"/>
+          <w:sz w:val="24"/>
+          <w:szCs w:val="24"/>
+        </w:rPr>
+        <w:t xml:space="preserve">Before you go</w:t>
+      </w:r>
+    </w:p>
+    <w:p>
+      <w:pPr>
+        <w:pStyle w:val="ListParagraph"/>
+        <w:numPr>
+          <w:ilvl w:val="0"/>
+          <w:numId w:val="2"/>
+        </w:numPr>
+        <w:spacing w:after="80"/>
+      </w:pPr>
+      <w:r>
+        <w:rPr>
+          <w:rFonts w:ascii="Calibri" w:cs="Calibri" w:eastAsia="Calibri" w:hAnsi="Calibri"/>
+          <w:color w:val="1F2933"/>
+          <w:sz w:val="21"/>
+          <w:szCs w:val="21"/>
+        </w:rPr>
+        <w:t xml:space="preserve">Set a target: 3-5 real conversations with property/facility managers, not 30 business-card exchanges. Quality over volume.</w:t>
+      </w:r>
+    </w:p>
+    <w:p>
+      <w:pPr>
+        <w:pStyle w:val="ListParagraph"/>
+        <w:numPr>
+          <w:ilvl w:val="0"/>
+          <w:numId w:val="2"/>
+        </w:numPr>
+        <w:spacing w:after="80"/>
+      </w:pPr>
+      <w:r>
+        <w:rPr>
+          <w:rFonts w:ascii="Calibri" w:cs="Calibri" w:eastAsia="Calibri" w:hAnsi="Calibri"/>
+          <w:color w:val="1F2933"/>
+          <w:sz w:val="21"/>
+          <w:szCs w:val="21"/>
+        </w:rPr>
+        <w:t xml:space="preserve">Have your 20-second pitch ready: who you help + the specific problem you solve. Example: "I do structured cabling and low-voltage work for office buildings around metro Detroit — cable drops, tenant moves, closet cleanups. Used to be on the technical side at an MSP, so I don't just pull cable and leave."</w:t>
+      </w:r>
+    </w:p>
+    <w:p>
+      <w:pPr>
+        <w:pStyle w:val="ListParagraph"/>
+        <w:numPr>
+          <w:ilvl w:val="0"/>
+          <w:numId w:val="2"/>
+        </w:numPr>
+        <w:spacing w:after="80"/>
+      </w:pPr>
+      <w:r>
+        <w:rPr>
+          <w:rFonts w:ascii="Calibri" w:cs="Calibri" w:eastAsia="Calibri" w:hAnsi="Calibri"/>
+          <w:color w:val="1F2933"/>
+          <w:sz w:val="21"/>
+          <w:szCs w:val="21"/>
+        </w:rPr>
+        <w:t xml:space="preserve">Know the ask going in: get a name + a way to follow up (email or a direct line), not a sale.</w:t>
+      </w:r>
+    </w:p>
+    <w:p>
+      <w:pPr>
+        <w:pStyle w:val="Heading2"/>
+        <w:spacing w:after="100" w:before="240"/>
+      </w:pPr>
+      <w:r>
+        <w:rPr>
+          <w:rFonts w:ascii="Calibri" w:cs="Calibri" w:eastAsia="Calibri" w:hAnsi="Calibri"/>
+          <w:b/>
+          <w:bCs/>
+          <w:color w:val="2E5266"/>
+          <w:sz w:val="24"/>
+          <w:szCs w:val="24"/>
+        </w:rPr>
+        <w:t xml:space="preserve">During</w:t>
+      </w:r>
+    </w:p>
+    <w:p>
+      <w:pPr>
+        <w:pStyle w:val="ListParagraph"/>
+        <w:numPr>
+          <w:ilvl w:val="0"/>
+          <w:numId w:val="2"/>
+        </w:numPr>
+        <w:spacing w:after="80"/>
+      </w:pPr>
+      <w:r>
+        <w:rPr>
+          <w:rFonts w:ascii="Calibri" w:cs="Calibri" w:eastAsia="Calibri" w:hAnsi="Calibri"/>
+          <w:color w:val="1F2933"/>
+          <w:sz w:val="21"/>
+          <w:szCs w:val="21"/>
+        </w:rPr>
+        <w:t xml:space="preserve">Lead with a question, not a pitch: "What's your building/portfolio like?" or "Anyone giving you trouble with cabling vendors right now?" People remember being asked about themselves more than being pitched to.</w:t>
+      </w:r>
+    </w:p>
+    <w:p>
+      <w:pPr>
+        <w:pStyle w:val="ListParagraph"/>
+        <w:numPr>
+          <w:ilvl w:val="0"/>
+          <w:numId w:val="2"/>
+        </w:numPr>
+        <w:spacing w:after="80"/>
+      </w:pPr>
+      <w:r>
+        <w:rPr>
+          <w:rFonts w:ascii="Calibri" w:cs="Calibri" w:eastAsia="Calibri" w:hAnsi="Calibri"/>
+          <w:color w:val="1F2933"/>
+          <w:sz w:val="21"/>
+          <w:szCs w:val="21"/>
+        </w:rPr>
+        <w:t xml:space="preserve">Keep your drink in your left hand so your right hand stays free, dry, and ready for handshakes.</w:t>
+      </w:r>
+    </w:p>
+    <w:p>
+      <w:pPr>
+        <w:pStyle w:val="ListParagraph"/>
+        <w:numPr>
+          <w:ilvl w:val="0"/>
+          <w:numId w:val="2"/>
+        </w:numPr>
+        <w:spacing w:after="80"/>
+      </w:pPr>
+      <w:r>
+        <w:rPr>
+          <w:rFonts w:ascii="Calibri" w:cs="Calibri" w:eastAsia="Calibri" w:hAnsi="Calibri"/>
+          <w:color w:val="1F2933"/>
+          <w:sz w:val="21"/>
+          <w:szCs w:val="21"/>
+        </w:rPr>
+        <w:t xml:space="preserve">If a conversation is going well, ask directly: "Can I follow up with you next week?" — get the specific yes before you walk away.</w:t>
+      </w:r>
+    </w:p>
+    <w:p>
+      <w:pPr>
+        <w:pStyle w:val="Heading2"/>
+        <w:spacing w:after="100" w:before="240"/>
+      </w:pPr>
+      <w:r>
+        <w:rPr>
+          <w:rFonts w:ascii="Calibri" w:cs="Calibri" w:eastAsia="Calibri" w:hAnsi="Calibri"/>
+          <w:b/>
+          <w:bCs/>
+          <w:color w:val="2E5266"/>
+          <w:sz w:val="24"/>
+          <w:szCs w:val="24"/>
+        </w:rPr>
+        <w:t xml:space="preserve">After — same day</w:t>
+      </w:r>
+    </w:p>
+    <w:p>
+      <w:pPr>
+        <w:pStyle w:val="ListParagraph"/>
+        <w:numPr>
+          <w:ilvl w:val="0"/>
+          <w:numId w:val="2"/>
+        </w:numPr>
+        <w:spacing w:after="80"/>
+      </w:pPr>
+      <w:r>
+        <w:rPr>
+          <w:rFonts w:ascii="Calibri" w:cs="Calibri" w:eastAsia="Calibri" w:hAnsi="Calibri"/>
+          <w:color w:val="1F2933"/>
+          <w:sz w:val="21"/>
+          <w:szCs w:val="21"/>
+        </w:rPr>
+        <w:t xml:space="preserve">Log every real conversation in the Pipeline tab that night: Company, Contact Name, Channel = Association/Networking, Status = Contacted, Notes = what you talked about.</w:t>
+      </w:r>
+    </w:p>
+    <w:p>
+      <w:pPr>
+        <w:pStyle w:val="ListParagraph"/>
+        <w:numPr>
+          <w:ilvl w:val="0"/>
+          <w:numId w:val="2"/>
+        </w:numPr>
+        <w:spacing w:after="80"/>
+      </w:pPr>
+      <w:r>
+        <w:rPr>
+          <w:rFonts w:ascii="Calibri" w:cs="Calibri" w:eastAsia="Calibri" w:hAnsi="Calibri"/>
+          <w:color w:val="1F2933"/>
+          <w:sz w:val="21"/>
+          <w:szCs w:val="21"/>
+        </w:rPr>
+        <w:t xml:space="preserve">Send the follow-up email (see templates above, adapted) within 24 hours while the conversation is still fresh for them too.</w:t>
+      </w:r>
+    </w:p>
+    <w:p>
+      <w:pPr>
+        <w:pStyle w:val="ListParagraph"/>
+        <w:numPr>
+          <w:ilvl w:val="0"/>
+          <w:numId w:val="2"/>
+        </w:numPr>
+        <w:spacing w:after="80"/>
+      </w:pPr>
+      <w:r>
+        <w:rPr>
+          <w:rFonts w:ascii="Calibri" w:cs="Calibri" w:eastAsia="Calibri" w:hAnsi="Calibri"/>
+          <w:color w:val="1F2933"/>
+          <w:sz w:val="21"/>
+          <w:szCs w:val="21"/>
+        </w:rPr>
+        <w:t xml:space="preserve">If someone was a clear "not now," still log them — a soft no today can become a Follow-up Scheduled in three months.</w:t>
       </w:r>
     </w:p>
     <w:p>

</xml_diff>